<commit_message>
Add BMJO work content and transparent green logo
</commit_message>
<xml_diff>
--- a/docs/ТЗ_BMJO_лендинг_Tilda_обновленное.docx
+++ b/docs/ТЗ_BMJO_лендинг_Tilda_обновленное.docx
@@ -4962,7 +4962,7 @@
                 <w:color w:val="3D3D39"/>
                 <w:sz w:val="15"/>
               </w:rPr>
-              <w:t>Пять связанных контуров</w:t>
+              <w:t>Наша работа</w:t>
             </w:r>
           </w:p>
         </w:tc>
@@ -4989,7 +4989,7 @@
                 <w:color w:val="3D3D39"/>
                 <w:sz w:val="15"/>
               </w:rPr>
-              <w:t>Сустав, прикус, мышцы, нервы, реабилитация. Каждый элемент - короткое определение и ссылка-якорь/подсказка.</w:t>
+              <w:t>Содержание переносится со старого bmjo.ru/#work: диагностика ВНЧС с применением МРТ, ЭМГ, ЭЭГ и УЗИ; хирургическая подготовка; индивидуальный репозиционирующий сплинт по МРТ и цифровому сканированию; физиотерапия; внутрисуставные инъекции плазмы; лечение патологий лицевого и тройничного нервов.</w:t>
             </w:r>
           </w:p>
         </w:tc>
@@ -5016,7 +5016,7 @@
                 <w:color w:val="3D3D39"/>
                 <w:sz w:val="15"/>
               </w:rPr>
-              <w:t>5 терминов и комментарии медицинского редактора; иконки в одном стиле.</w:t>
+              <w:t>6 карточек с иконками; медицинская редактура; ссылки на услуги клиники; предупреждение о подборе маршрута врачом.</w:t>
             </w:r>
           </w:p>
         </w:tc>
@@ -5070,7 +5070,7 @@
                 <w:color w:val="3D3D39"/>
                 <w:sz w:val="15"/>
               </w:rPr>
-              <w:t>HW202</w:t>
+              <w:t>CL18N</w:t>
             </w:r>
           </w:p>
         </w:tc>
@@ -5096,7 +5096,7 @@
                 <w:color w:val="3D3D39"/>
                 <w:sz w:val="15"/>
               </w:rPr>
-              <w:t>Логика BMJO</w:t>
+              <w:t>Пять связанных контуров</w:t>
             </w:r>
           </w:p>
         </w:tc>
@@ -5122,7 +5122,7 @@
                 <w:color w:val="3D3D39"/>
                 <w:sz w:val="15"/>
               </w:rPr>
-              <w:t>Собрать → сопоставить → приоритизировать → выстроить → контролировать. CTA на /methodology.</w:t>
+              <w:t>Сустав, прикус, мышцы, нервы, реабилитация. Каждый элемент - короткое определение и ссылка-якорь/подсказка.</w:t>
             </w:r>
           </w:p>
         </w:tc>
@@ -5148,7 +5148,7 @@
                 <w:color w:val="3D3D39"/>
                 <w:sz w:val="15"/>
               </w:rPr>
-              <w:t>Тексты шагов до 120 знаков; mobile - вертикальный порядок.</w:t>
+              <w:t>5 терминов и комментарии медицинского редактора; иконки в одном стиле.</w:t>
             </w:r>
           </w:p>
         </w:tc>
@@ -5204,7 +5204,7 @@
                 <w:color w:val="3D3D39"/>
                 <w:sz w:val="15"/>
               </w:rPr>
-              <w:t>SV102</w:t>
+              <w:t>HW202</w:t>
             </w:r>
           </w:p>
         </w:tc>
@@ -5231,7 +5231,7 @@
                 <w:color w:val="3D3D39"/>
                 <w:sz w:val="15"/>
               </w:rPr>
-              <w:t>Автор концепции</w:t>
+              <w:t>Логика BMJO</w:t>
             </w:r>
           </w:p>
         </w:tc>
@@ -5258,7 +5258,7 @@
                 <w:color w:val="3D3D39"/>
                 <w:sz w:val="15"/>
               </w:rPr>
-              <w:t>Фото, краткая биография Дмитрия Юдина, ключевые специализации и достижения, ссылка на страницу доктора на yudinclinic.ru.</w:t>
+              <w:t>Собрать → сопоставить → приоритизировать → выстроить → контролировать. CTA на /methodology.</w:t>
             </w:r>
           </w:p>
         </w:tc>
@@ -5285,7 +5285,7 @@
                 <w:color w:val="3D3D39"/>
                 <w:sz w:val="15"/>
               </w:rPr>
-              <w:t>Портрет 1600×1200; утвержденная биография 500-800 знаков; 4 достижения с подтверждением.</w:t>
+              <w:t>Тексты шагов до 120 знаков; mobile - вертикальный порядок.</w:t>
             </w:r>
           </w:p>
         </w:tc>
@@ -5339,7 +5339,7 @@
                 <w:color w:val="3D3D39"/>
                 <w:sz w:val="15"/>
               </w:rPr>
-              <w:t>SV306</w:t>
+              <w:t>SV102</w:t>
             </w:r>
           </w:p>
         </w:tc>
@@ -5365,7 +5365,7 @@
                 <w:color w:val="3D3D39"/>
                 <w:sz w:val="15"/>
               </w:rPr>
-              <w:t>Превью клинических случаев</w:t>
+              <w:t>Автор концепции</w:t>
             </w:r>
           </w:p>
         </w:tc>
@@ -5391,7 +5391,7 @@
                 <w:color w:val="3D3D39"/>
                 <w:sz w:val="15"/>
               </w:rPr>
-              <w:t>Три карточки разных клинических маршрутов; диагноз/исходная проблема, 1-2 шага, характер динамики. CTA на /cases.</w:t>
+              <w:t>Фото, краткая биография Дмитрия Юдина, ключевые специализации и достижения, ссылка на страницу доктора на yudinclinic.ru.</w:t>
             </w:r>
           </w:p>
         </w:tc>
@@ -5417,7 +5417,7 @@
                 <w:color w:val="3D3D39"/>
                 <w:sz w:val="15"/>
               </w:rPr>
-              <w:t>По 1 главному фото; обезличенные тексты; письменные согласия пациентов.</w:t>
+              <w:t>Портрет 1600×1200; утвержденная биография 500-800 знаков; 4 достижения с подтверждением.</w:t>
             </w:r>
           </w:p>
         </w:tc>
@@ -5473,7 +5473,7 @@
                 <w:color w:val="3D3D39"/>
                 <w:sz w:val="15"/>
               </w:rPr>
-              <w:t>GL20</w:t>
+              <w:t>SV306</w:t>
             </w:r>
           </w:p>
         </w:tc>
@@ -5500,7 +5500,7 @@
                 <w:color w:val="3D3D39"/>
                 <w:sz w:val="15"/>
               </w:rPr>
-              <w:t>Патенты и документы</w:t>
+              <w:t>Превью клинических случаев</w:t>
             </w:r>
           </w:p>
         </w:tc>
@@ -5527,7 +5527,7 @@
                 <w:color w:val="3D3D39"/>
                 <w:sz w:val="15"/>
               </w:rPr>
-              <w:t>Галерея с полноэкранным просмотром: патенты, сертификаты, научные материалы. Название, дата, тип документа.</w:t>
+              <w:t>Три карточки разных клинических маршрутов; диагноз/исходная проблема, 1-2 шага, характер динамики. CTA на /cases.</w:t>
             </w:r>
           </w:p>
         </w:tc>
@@ -5554,7 +5554,7 @@
                 <w:color w:val="3D3D39"/>
                 <w:sz w:val="15"/>
               </w:rPr>
-              <w:t>Сканы 1600-2400 px; PDF оригиналов; подписи и alt; отбор 6-12 материалов.</w:t>
+              <w:t>По 1 главному фото; обезличенные тексты; письменные согласия пациентов.</w:t>
             </w:r>
           </w:p>
         </w:tc>
@@ -5608,7 +5608,7 @@
                 <w:color w:val="3D3D39"/>
                 <w:sz w:val="15"/>
               </w:rPr>
-              <w:t>TX16N</w:t>
+              <w:t>GL20</w:t>
             </w:r>
           </w:p>
         </w:tc>
@@ -5634,7 +5634,7 @@
                 <w:color w:val="3D3D39"/>
                 <w:sz w:val="15"/>
               </w:rPr>
-              <w:t>FAQ о концепции</w:t>
+              <w:t>Патенты и документы</w:t>
             </w:r>
           </w:p>
         </w:tc>
@@ -5660,7 +5660,7 @@
                 <w:color w:val="3D3D39"/>
                 <w:sz w:val="15"/>
               </w:rPr>
-              <w:t>Что такое BMJO; является ли это процедурой; кому может быть полезен подход; одинаков ли маршрут; где смотреть услуги и цены.</w:t>
+              <w:t>Галерея с полноэкранным просмотром: патенты, сертификаты, научные материалы. Название, дата, тип документа.</w:t>
             </w:r>
           </w:p>
         </w:tc>
@@ -5686,7 +5686,7 @@
                 <w:color w:val="3D3D39"/>
                 <w:sz w:val="15"/>
               </w:rPr>
-              <w:t>5-7 утвержденных ответов по 300-600 знаков.</w:t>
+              <w:t>Сканы 1600-2400 px; PDF оригиналов; подписи и alt; отбор 6-12 материалов.</w:t>
             </w:r>
           </w:p>
         </w:tc>
@@ -5742,6 +5742,141 @@
                 <w:color w:val="3D3D39"/>
                 <w:sz w:val="15"/>
               </w:rPr>
+              <w:t>TX16N</w:t>
+            </w:r>
+          </w:p>
+        </w:tc>
+        <w:tc>
+          <w:tcPr>
+            <w:tcW w:type="dxa" w:w="1700"/>
+            <w:tcMar>
+              <w:top w:w="80" w:type="dxa"/>
+              <w:start w:w="120" w:type="dxa"/>
+              <w:bottom w:w="80" w:type="dxa"/>
+              <w:end w:w="120" w:type="dxa"/>
+            </w:tcMar>
+            <w:vAlign w:val="center"/>
+            <w:shd w:fill="F8F8F6"/>
+          </w:tcPr>
+          <w:p>
+            <w:pPr>
+              <w:spacing w:after="0" w:line="276" w:lineRule="auto"/>
+            </w:pPr>
+            <w:r>
+              <w:rPr>
+                <w:rFonts w:ascii="Calibri" w:hAnsi="Calibri"/>
+                <w:b w:val="0"/>
+                <w:color w:val="3D3D39"/>
+                <w:sz w:val="15"/>
+              </w:rPr>
+              <w:t>FAQ о концепции</w:t>
+            </w:r>
+          </w:p>
+        </w:tc>
+        <w:tc>
+          <w:tcPr>
+            <w:tcW w:type="dxa" w:w="3540"/>
+            <w:tcMar>
+              <w:top w:w="80" w:type="dxa"/>
+              <w:start w:w="120" w:type="dxa"/>
+              <w:bottom w:w="80" w:type="dxa"/>
+              <w:end w:w="120" w:type="dxa"/>
+            </w:tcMar>
+            <w:vAlign w:val="center"/>
+            <w:shd w:fill="F8F8F6"/>
+          </w:tcPr>
+          <w:p>
+            <w:pPr>
+              <w:spacing w:after="0" w:line="276" w:lineRule="auto"/>
+            </w:pPr>
+            <w:r>
+              <w:rPr>
+                <w:rFonts w:ascii="Calibri" w:hAnsi="Calibri"/>
+                <w:b w:val="0"/>
+                <w:color w:val="3D3D39"/>
+                <w:sz w:val="15"/>
+              </w:rPr>
+              <w:t>Что такое BMJO; является ли это процедурой; кому может быть полезен подход; одинаков ли маршрут; где смотреть услуги и цены.</w:t>
+            </w:r>
+          </w:p>
+        </w:tc>
+        <w:tc>
+          <w:tcPr>
+            <w:tcW w:type="dxa" w:w="2720"/>
+            <w:tcMar>
+              <w:top w:w="80" w:type="dxa"/>
+              <w:start w:w="120" w:type="dxa"/>
+              <w:bottom w:w="80" w:type="dxa"/>
+              <w:end w:w="120" w:type="dxa"/>
+            </w:tcMar>
+            <w:vAlign w:val="center"/>
+            <w:shd w:fill="F8F8F6"/>
+          </w:tcPr>
+          <w:p>
+            <w:pPr>
+              <w:spacing w:after="0" w:line="276" w:lineRule="auto"/>
+            </w:pPr>
+            <w:r>
+              <w:rPr>
+                <w:rFonts w:ascii="Calibri" w:hAnsi="Calibri"/>
+                <w:b w:val="0"/>
+                <w:color w:val="3D3D39"/>
+                <w:sz w:val="15"/>
+              </w:rPr>
+              <w:t>5-7 утвержденных ответов по 300-600 знаков.</w:t>
+            </w:r>
+          </w:p>
+        </w:tc>
+      </w:tr>
+      <w:tr>
+        <w:tc>
+          <w:tcPr>
+            <w:tcW w:type="dxa" w:w="500"/>
+            <w:tcMar>
+              <w:top w:w="80" w:type="dxa"/>
+              <w:start w:w="120" w:type="dxa"/>
+              <w:bottom w:w="80" w:type="dxa"/>
+              <w:end w:w="120" w:type="dxa"/>
+            </w:tcMar>
+            <w:vAlign w:val="center"/>
+          </w:tcPr>
+          <w:p>
+            <w:pPr>
+              <w:spacing w:after="0" w:line="276" w:lineRule="auto"/>
+            </w:pPr>
+            <w:r>
+              <w:rPr>
+                <w:rFonts w:ascii="Calibri" w:hAnsi="Calibri"/>
+                <w:b/>
+                <w:color w:val="3D3D39"/>
+                <w:sz w:val="15"/>
+              </w:rPr>
+              <w:t>11</w:t>
+            </w:r>
+          </w:p>
+        </w:tc>
+        <w:tc>
+          <w:tcPr>
+            <w:tcW w:type="dxa" w:w="900"/>
+            <w:tcMar>
+              <w:top w:w="80" w:type="dxa"/>
+              <w:start w:w="120" w:type="dxa"/>
+              <w:bottom w:w="80" w:type="dxa"/>
+              <w:end w:w="120" w:type="dxa"/>
+            </w:tcMar>
+            <w:vAlign w:val="center"/>
+          </w:tcPr>
+          <w:p>
+            <w:pPr>
+              <w:spacing w:after="0" w:line="276" w:lineRule="auto"/>
+            </w:pPr>
+            <w:r>
+              <w:rPr>
+                <w:rFonts w:ascii="Calibri" w:hAnsi="Calibri"/>
+                <w:b w:val="0"/>
+                <w:color w:val="3D3D39"/>
+                <w:sz w:val="15"/>
+              </w:rPr>
               <w:t>BF301</w:t>
             </w:r>
           </w:p>
@@ -5756,7 +5891,6 @@
               <w:end w:w="120" w:type="dxa"/>
             </w:tcMar>
             <w:vAlign w:val="center"/>
-            <w:shd w:fill="F8F8F6"/>
           </w:tcPr>
           <w:p>
             <w:pPr>
@@ -5783,7 +5917,6 @@
               <w:end w:w="120" w:type="dxa"/>
             </w:tcMar>
             <w:vAlign w:val="center"/>
-            <w:shd w:fill="F8F8F6"/>
           </w:tcPr>
           <w:p>
             <w:pPr>
@@ -5810,7 +5943,6 @@
               <w:end w:w="120" w:type="dxa"/>
             </w:tcMar>
             <w:vAlign w:val="center"/>
-            <w:shd w:fill="F8F8F6"/>
           </w:tcPr>
           <w:p>
             <w:pPr>

</xml_diff>